<commit_message>
Corrige le statut AD après délai et signale les résultats partiels
Sépare les délais de requête des erreurs réseau sans lever une panne établie.
Conserve les gardes de fraîcheur, de session et d’écriture incertaine.
Précise les compteurs pendant le chargement, après interruption et à la limite.

Livre RC1.17.5 avec les packs DEV/PROD classiques et les guides 1.0 actualisés.
36 cas ciblés passent sous PS7 ; Windows/WPF et AD réel restent à tester.
La cause du délai observé de 45 secondes n’est pas établie par les photos.
</commit_message>
<xml_diff>
--- a/DOC/Domenia-1.0-Guide-administrateur.docx
+++ b/DOC/Domenia-1.0-Guide-administrateur.docx
@@ -2237,7 +2237,7 @@
         </w:numPr>
       </w:pPr>
       <w:r>
-        <w:t xml:space="preserve">Délais : Browser.SearchServerTimeLimitSeconds (8 s, côté contrôleur) et Browser.SearchClientTimeoutSeconds (12 s, côté poste).</w:t>
+        <w:t xml:space="preserve">Délais LDAP : Browser.SearchServerTimeLimitSeconds (8 s, côté contrôleur) et Browser.SearchClientTimeoutSeconds (12 s, côté poste). Async.SearchTimeoutSeconds borne la recherche globale à 45 s par défaut.</w:t>
       </w:r>
     </w:p>
     <w:p>
@@ -2274,6 +2274,14 @@
       </w:pPr>
       <w:r>
         <w:t xml:space="preserve">Classement : Features.SearchRanking (vrai) ordonne les résultats d'une recherche globale ; sans lui, ils restent dans l'ordre d'arrivée.</w:t>
+      </w:r>
+    </w:p>
+    <w:p>
+      <w:pPr>
+        <w:keepNext w:val="false"/>
+      </w:pPr>
+      <w:r>
+        <w:t xml:space="preserve">Le badge orange « Dernière requête AD : délai dépassé » signale une requête trop longue, sans établir une panne réseau. Affinez la recherche et consultez le journal. « AD injoignable » en rouge correspond à une erreur réseau. La prochaine lecture AD réussie rétablit le badge normal.</w:t>
       </w:r>
     </w:p>
     <w:p>
@@ -3228,7 +3236,7 @@
         <w:keepNext w:val="false"/>
       </w:pPr>
       <w:r>
-        <w:t xml:space="preserve">Le champ « Dans les résultats » filtre la liste déjà chargée, sans appel AD : nom, login, type, présence et association. La limite LDAP ne change pas.</w:t>
+        <w:t xml:space="preserve">« Dans les résultats » filtre les objets déjà chargés, sans appel AD ni changement de limite LDAP. Le compteur rapporte les lignes visibles aux objets chargés, pas au total du domaine. « Liste partielle » signale une lecture incomplète ou en erreur : même 746/746 ne certifie pas son exhaustivité.</w:t>
       </w:r>
     </w:p>
     <w:p>

</xml_diff>

<commit_message>
Fix AD search deadlines with progress tracking and publish RC1.17.6
</commit_message>
<xml_diff>
--- a/DOC/Domenia-1.0-Guide-administrateur.docx
+++ b/DOC/Domenia-1.0-Guide-administrateur.docx
@@ -2237,7 +2237,7 @@
         </w:numPr>
       </w:pPr>
       <w:r>
-        <w:t xml:space="preserve">Délais LDAP : Browser.SearchServerTimeLimitSeconds (8 s, côté contrôleur) et Browser.SearchClientTimeoutSeconds (12 s, côté poste). Async.SearchTimeoutSeconds borne la recherche globale à 45 s par défaut.</w:t>
+        <w:t xml:space="preserve">Recherche globale : 120 s sans nouvel objet AD, 900 s au total ; annulation possible. Délais LDAP : 60/90 s, pages de 250 objets. Réglages et bornes au chapitre 17.</w:t>
       </w:r>
     </w:p>
     <w:p>
@@ -48341,7 +48341,7 @@
                 <w:sz w:val="19"/>
                 <w:szCs w:val="19"/>
               </w:rPr>
-              <w:t xml:space="preserve">Browser.SearchServerTimeLimitSeconds</w:t>
+              <w:t xml:space="preserve">Browser.SearchPageSize</w:t>
             </w:r>
           </w:p>
         </w:tc>
@@ -48368,7 +48368,7 @@
                 <w:sz w:val="19"/>
                 <w:szCs w:val="19"/>
               </w:rPr>
-              <w:t xml:space="preserve">8</w:t>
+              <w:t xml:space="preserve">250</w:t>
             </w:r>
           </w:p>
         </w:tc>
@@ -48395,7 +48395,7 @@
                 <w:sz w:val="19"/>
                 <w:szCs w:val="19"/>
               </w:rPr>
-              <w:t xml:space="preserve">Délai côté contrôleur.</w:t>
+              <w:t xml:space="preserve">Objets par page de recherche LDAP (100 à 1 000).</w:t>
             </w:r>
           </w:p>
         </w:tc>
@@ -48428,7 +48428,7 @@
                 <w:sz w:val="19"/>
                 <w:szCs w:val="19"/>
               </w:rPr>
-              <w:t xml:space="preserve">Browser.SearchClientTimeoutSeconds</w:t>
+              <w:t xml:space="preserve">Browser.SearchServerTimeLimitSeconds, SearchClientTimeoutSeconds</w:t>
             </w:r>
           </w:p>
         </w:tc>
@@ -48455,7 +48455,7 @@
                 <w:sz w:val="19"/>
                 <w:szCs w:val="19"/>
               </w:rPr>
-              <w:t xml:space="preserve">12</w:t>
+              <w:t xml:space="preserve">60, 90</w:t>
             </w:r>
           </w:p>
         </w:tc>
@@ -48482,7 +48482,7 @@
                 <w:sz w:val="19"/>
                 <w:szCs w:val="19"/>
               </w:rPr>
-              <w:t xml:space="preserve">Délai côté poste.</w:t>
+              <w:t xml:space="preserve">LDAP : serveur de 60 à 300 s ; client ≥ serveur + 30 s, jusqu’à 600 s.</w:t>
             </w:r>
           </w:p>
         </w:tc>
@@ -48848,6 +48848,14 @@
       </w:pPr>
       <w:r>
         <w:t xml:space="preserve">Moteur et cache</w:t>
+      </w:r>
+    </w:p>
+    <w:p>
+      <w:pPr>
+        <w:keepNext w:val="false"/>
+      </w:pPr>
+      <w:r>
+        <w:t xml:space="preserve">Pour la recherche globale, seuls les nouveaux objets reçus d’AD relancent le délai d’inactivité ; les lignes du cache et leur affichage ne comptent pas. Le plafond total reste fixe et la file d’attente est exclue. La taille de page LDAP ne change ni le périmètre ni la limite de résultats.</w:t>
       </w:r>
     </w:p>
     <w:tbl>
@@ -49507,7 +49515,7 @@
                 <w:sz w:val="19"/>
                 <w:szCs w:val="19"/>
               </w:rPr>
-              <w:t xml:space="preserve">Async.SearchTimeoutSeconds, ObjectTimeoutSeconds, TreeTimeoutSeconds</w:t>
+              <w:t xml:space="preserve">Async.SearchTimeoutSeconds, SearchMaxDurationSeconds</w:t>
             </w:r>
           </w:p>
         </w:tc>
@@ -49534,7 +49542,7 @@
                 <w:sz w:val="19"/>
                 <w:szCs w:val="19"/>
               </w:rPr>
-              <w:t xml:space="preserve">45, 35, 30</w:t>
+              <w:t xml:space="preserve">120, 900</w:t>
             </w:r>
           </w:p>
         </w:tc>
@@ -49561,7 +49569,94 @@
                 <w:sz w:val="19"/>
                 <w:szCs w:val="19"/>
               </w:rPr>
-              <w:t xml:space="preserve">Délais des recherches, fiches et arbre.</w:t>
+              <w:t xml:space="preserve">Recherche globale : inactivité AD de 120 à 600 s (plancher automatique) ; durée totale ≥ inactivité, jusqu’à 3 600 s, hors attente.</w:t>
+            </w:r>
+          </w:p>
+        </w:tc>
+      </w:tr>
+      <w:tr>
+        <w:trPr>
+          <w:cantSplit/>
+          <w:tblHeader w:val="off"/>
+        </w:trPr>
+        <w:tc>
+          <w:tcPr>
+            <w:tcW w:type="dxa" w:w="4048"/>
+            <w:tcMar>
+              <w:top w:type="dxa" w:w="95"/>
+              <w:left w:type="dxa" w:w="120"/>
+              <w:bottom w:type="dxa" w:w="95"/>
+              <w:right w:type="dxa" w:w="120"/>
+            </w:tcMar>
+            <w:vAlign w:val="center"/>
+          </w:tcPr>
+          <w:p>
+            <w:pPr>
+              <w:spacing w:after="0"/>
+            </w:pPr>
+            <w:r>
+              <w:rPr>
+                <w:b w:val="false"/>
+                <w:bCs w:val="false"/>
+                <w:color w:val="000000"/>
+                <w:sz w:val="19"/>
+                <w:szCs w:val="19"/>
+              </w:rPr>
+              <w:t xml:space="preserve">Async.ObjectTimeoutSeconds, TreeTimeoutSeconds</w:t>
+            </w:r>
+          </w:p>
+        </w:tc>
+        <w:tc>
+          <w:tcPr>
+            <w:tcW w:type="dxa" w:w="1542"/>
+            <w:tcMar>
+              <w:top w:type="dxa" w:w="95"/>
+              <w:left w:type="dxa" w:w="120"/>
+              <w:bottom w:type="dxa" w:w="95"/>
+              <w:right w:type="dxa" w:w="120"/>
+            </w:tcMar>
+            <w:vAlign w:val="center"/>
+          </w:tcPr>
+          <w:p>
+            <w:pPr>
+              <w:spacing w:after="0"/>
+            </w:pPr>
+            <w:r>
+              <w:rPr>
+                <w:b w:val="false"/>
+                <w:bCs w:val="false"/>
+                <w:color w:val="000000"/>
+                <w:sz w:val="19"/>
+                <w:szCs w:val="19"/>
+              </w:rPr>
+              <w:t xml:space="preserve">35, 30</w:t>
+            </w:r>
+          </w:p>
+        </w:tc>
+        <w:tc>
+          <w:tcPr>
+            <w:tcW w:type="dxa" w:w="4048"/>
+            <w:tcMar>
+              <w:top w:type="dxa" w:w="95"/>
+              <w:left w:type="dxa" w:w="120"/>
+              <w:bottom w:type="dxa" w:w="95"/>
+              <w:right w:type="dxa" w:w="120"/>
+            </w:tcMar>
+            <w:vAlign w:val="center"/>
+          </w:tcPr>
+          <w:p>
+            <w:pPr>
+              <w:spacing w:after="0"/>
+            </w:pPr>
+            <w:r>
+              <w:rPr>
+                <w:b w:val="false"/>
+                <w:bCs w:val="false"/>
+                <w:color w:val="000000"/>
+                <w:sz w:val="19"/>
+                <w:szCs w:val="19"/>
+              </w:rPr>
+              <w:t xml:space="preserve">Délais des fiches et de l’arbre.</w:t>
             </w:r>
           </w:p>
         </w:tc>

</xml_diff>